<commit_message>
Updated Lab 7 document
</commit_message>
<xml_diff>
--- a/LAB 7/EDGE INTELLIGENCE  LAB 7.docx
+++ b/LAB 7/EDGE INTELLIGENCE  LAB 7.docx
@@ -96,27 +96,37 @@
           <w:sz w:val="28"/>
           <w:szCs w:val="28"/>
         </w:rPr>
-        <w:t>43</w:t>
-      </w:r>
-    </w:p>
-    <w:p>
-      <w:pPr>
-        <w:rPr>
-          <w:rFonts w:ascii="Times New Roman" w:hAnsi="Times New Roman" w:cs="Times New Roman"/>
-          <w:b/>
-          <w:sz w:val="28"/>
-          <w:szCs w:val="28"/>
-        </w:rPr>
-      </w:pPr>
-      <w:r>
-        <w:rPr>
-          <w:rFonts w:ascii="Times New Roman" w:hAnsi="Times New Roman" w:cs="Times New Roman"/>
-          <w:b/>
-          <w:sz w:val="28"/>
-          <w:szCs w:val="28"/>
-        </w:rPr>
-        <w:t>GANESH G</w:t>
-      </w:r>
+        <w:t>38</w:t>
+      </w:r>
+    </w:p>
+    <w:p>
+      <w:pPr>
+        <w:rPr>
+          <w:rFonts w:ascii="Times New Roman" w:hAnsi="Times New Roman" w:cs="Times New Roman"/>
+          <w:b/>
+          <w:sz w:val="28"/>
+          <w:szCs w:val="28"/>
+        </w:rPr>
+      </w:pPr>
+      <w:r>
+        <w:rPr>
+          <w:rFonts w:ascii="Times New Roman" w:hAnsi="Times New Roman" w:cs="Times New Roman"/>
+          <w:b/>
+          <w:sz w:val="28"/>
+          <w:szCs w:val="28"/>
+        </w:rPr>
+        <w:t>SUBHASHINI M</w:t>
+      </w:r>
+    </w:p>
+    <w:p>
+      <w:pPr>
+        <w:rPr>
+          <w:rFonts w:ascii="Times New Roman" w:hAnsi="Times New Roman" w:cs="Times New Roman"/>
+          <w:b/>
+          <w:sz w:val="28"/>
+          <w:szCs w:val="28"/>
+        </w:rPr>
+      </w:pPr>
       <w:bookmarkStart w:id="0" w:name="_GoBack"/>
       <w:bookmarkEnd w:id="0"/>
     </w:p>
@@ -595,27 +605,7 @@
           <w:szCs w:val="24"/>
           <w:lang w:eastAsia="en-IN"/>
         </w:rPr>
-        <w:t xml:space="preserve"> Convert the frame </w:t>
-      </w:r>
-      <w:proofErr w:type="spellStart"/>
-      <w:r>
-        <w:rPr>
-          <w:rFonts w:ascii="Times New Roman" w:eastAsia="Times New Roman" w:hAnsi="Times New Roman" w:cs="Times New Roman"/>
-          <w:sz w:val="24"/>
-          <w:szCs w:val="24"/>
-          <w:lang w:eastAsia="en-IN"/>
-        </w:rPr>
-        <w:t>color</w:t>
-      </w:r>
-      <w:proofErr w:type="spellEnd"/>
-      <w:r>
-        <w:rPr>
-          <w:rFonts w:ascii="Times New Roman" w:eastAsia="Times New Roman" w:hAnsi="Times New Roman" w:cs="Times New Roman"/>
-          <w:sz w:val="24"/>
-          <w:szCs w:val="24"/>
-          <w:lang w:eastAsia="en-IN"/>
-        </w:rPr>
-        <w:t xml:space="preserve"> format from BGR to RGB for proper visualization.</w:t>
+        <w:t xml:space="preserve"> Convert the frame color format from BGR to RGB for proper visualization.</w:t>
       </w:r>
     </w:p>
     <w:p>

</xml_diff>